<commit_message>
Keep numbers, dates and formulas left to right in Word exams
Word lays out the neutral characters of a right-to-left run from right to
left, so "2026/2027" printed as "2027/2026" and "5*4*2 = 40" as
"40 = 2*4*5". BidiText now splits Arabic text into left-to-right islands
(bracket-aware, sentence punctuation stays Arabic) and the Word
post-processor moves each island into a run without w:rtl.

Also from the visual review:
- The closing line is a single paragraph, so the good-luck wish can no
  longer spill onto an otherwise empty page
- Wider marks column so "(علامة واحدة)" no longer wraps
</commit_message>
<xml_diff>
--- a/ExamTemplate.Documents/Word/ExamTemplate.docx
+++ b/ExamTemplate.Documents/Word/ExamTemplate.docx
@@ -1429,10 +1429,10 @@
       </w:tblPr>
       <w:tblGrid>
         <w:gridCol w:w="567"/>
-        <w:gridCol w:w="6519"/>
+        <w:gridCol w:w="6236"/>
         <w:gridCol w:w="1134"/>
         <w:gridCol w:w="1134"/>
-        <w:gridCol w:w="1134"/>
+        <w:gridCol w:w="1417"/>
       </w:tblGrid>
       <w:tr>
         <w:trPr>
@@ -1457,7 +1457,7 @@
         </w:tc>
         <w:tc>
           <w:tcPr>
-            <w:tcW w:w="6519" w:type="dxa"/>
+            <w:tcW w:w="6236" w:type="dxa"/>
             <w:vAlign w:val="top"/>
           </w:tcPr>
           <w:p>
@@ -1562,7 +1562,7 @@
         </w:tc>
         <w:tc>
           <w:tcPr>
-            <w:tcW w:w="1134" w:type="dxa"/>
+            <w:tcW w:w="1417" w:type="dxa"/>
             <w:vAlign w:val="top"/>
           </w:tcPr>
           <w:p>
@@ -1613,8 +1613,8 @@
       </w:tblPr>
       <w:tblGrid>
         <w:gridCol w:w="567"/>
-        <w:gridCol w:w="8787"/>
-        <w:gridCol w:w="1134"/>
+        <w:gridCol w:w="8504"/>
+        <w:gridCol w:w="1417"/>
       </w:tblGrid>
       <w:tr>
         <w:trPr>
@@ -1639,7 +1639,7 @@
         </w:tc>
         <w:tc>
           <w:tcPr>
-            <w:tcW w:w="8787" w:type="dxa"/>
+            <w:tcW w:w="8504" w:type="dxa"/>
             <w:vAlign w:val="top"/>
           </w:tcPr>
           <w:p>
@@ -1696,7 +1696,7 @@
         </w:tc>
         <w:tc>
           <w:tcPr>
-            <w:tcW w:w="1134" w:type="dxa"/>
+            <w:tcW w:w="1417" w:type="dxa"/>
             <w:vAlign w:val="top"/>
           </w:tcPr>
           <w:p>
@@ -2572,38 +2572,12 @@
         </w:rPr>
         <w:t xml:space="preserve">{{EndText}}</w:t>
       </w:r>
-    </w:p>
-    <w:p>
-      <w:pPr>
-        <w:pStyle w:val="TemplateControl"/>
-      </w:pPr>
       <w:r>
         <w:rPr>
-          <w:rtl/>
-        </w:rPr>
-        <w:t xml:space="preserve">{{#if HasEndNote}}</w:t>
-      </w:r>
-    </w:p>
-    <w:p>
-      <w:pPr>
-        <w:pStyle w:val="ExamEndNote"/>
-      </w:pPr>
-      <w:r>
-        <w:rPr>
+          <w:rStyle w:val="ExamEndNoteChar"/>
           <w:rtl/>
         </w:rPr>
         <w:t xml:space="preserve">{{EndNote}}</w:t>
-      </w:r>
-    </w:p>
-    <w:p>
-      <w:pPr>
-        <w:pStyle w:val="TemplateControl"/>
-      </w:pPr>
-      <w:r>
-        <w:rPr>
-          <w:rtl/>
-        </w:rPr>
-        <w:t xml:space="preserve">{{/if}}</w:t>
       </w:r>
     </w:p>
     <w:sectPr>
@@ -3347,7 +3321,7 @@
     <w:qFormat/>
     <w:pPr>
       <w:bidi/>
-      <w:spacing w:before="240" w:after="0" w:line="240" w:lineRule="auto"/>
+      <w:spacing w:before="160" w:after="0" w:line="240" w:lineRule="auto"/>
       <w:jc w:val="center"/>
     </w:pPr>
     <w:rPr>
@@ -3359,146 +3333,141 @@
       <w:szCs w:val="22"/>
     </w:rPr>
   </w:style>
-  <w:style w:type="paragraph" w:customStyle="1" w:styleId="ExamEndNote">
-    <w:name w:val="ExamEndNote"/>
-    <w:basedOn w:val="Normal"/>
-    <w:qFormat/>
-    <w:pPr>
-      <w:bidi/>
-      <w:spacing w:before="40" w:after="0" w:line="240" w:lineRule="auto"/>
+  <w:style w:type="paragraph" w:customStyle="1" w:styleId="ExamFooter">
+    <w:name w:val="ExamFooter"/>
+    <w:basedOn w:val="Normal"/>
+    <w:qFormat/>
+    <w:pPr>
+      <w:bidi/>
+      <w:spacing w:before="0" w:after="0" w:line="240" w:lineRule="auto"/>
+    </w:pPr>
+    <w:rPr>
+      <w:rFonts w:ascii="Noto Naskh Arabic" w:hAnsi="Noto Naskh Arabic" w:eastAsia="Noto Naskh Arabic" w:cs="Noto Naskh Arabic"/>
+      <w:color w:val="404040"/>
+      <w:sz w:val="18"/>
+      <w:szCs w:val="18"/>
+    </w:rPr>
+  </w:style>
+  <w:style w:type="paragraph" w:customStyle="1" w:styleId="ExamFooterCenter">
+    <w:name w:val="ExamFooterCenter"/>
+    <w:basedOn w:val="Normal"/>
+    <w:qFormat/>
+    <w:pPr>
+      <w:bidi/>
+      <w:spacing w:before="0" w:after="0" w:line="240" w:lineRule="auto"/>
       <w:jc w:val="center"/>
     </w:pPr>
     <w:rPr>
       <w:rFonts w:ascii="Noto Naskh Arabic" w:hAnsi="Noto Naskh Arabic" w:eastAsia="Noto Naskh Arabic" w:cs="Noto Naskh Arabic"/>
+      <w:color w:val="404040"/>
+      <w:sz w:val="18"/>
+      <w:szCs w:val="18"/>
+    </w:rPr>
+  </w:style>
+  <w:style w:type="paragraph" w:customStyle="1" w:styleId="ExamFooterEnd">
+    <w:name w:val="ExamFooterEnd"/>
+    <w:basedOn w:val="Normal"/>
+    <w:qFormat/>
+    <w:pPr>
+      <w:bidi/>
+      <w:spacing w:before="0" w:after="0" w:line="240" w:lineRule="auto"/>
+      <w:jc w:val="right"/>
+    </w:pPr>
+    <w:rPr>
+      <w:rFonts w:ascii="Noto Naskh Arabic" w:hAnsi="Noto Naskh Arabic" w:eastAsia="Noto Naskh Arabic" w:cs="Noto Naskh Arabic"/>
+      <w:color w:val="404040"/>
+      <w:sz w:val="18"/>
+      <w:szCs w:val="18"/>
+    </w:rPr>
+  </w:style>
+  <w:style w:type="paragraph" w:customStyle="1" w:styleId="ExamSpacer">
+    <w:name w:val="ExamSpacer"/>
+    <w:basedOn w:val="Normal"/>
+    <w:qFormat/>
+    <w:pPr>
+      <w:bidi/>
+      <w:spacing w:before="0" w:after="0" w:line="120" w:lineRule="exact"/>
+    </w:pPr>
+    <w:rPr>
+      <w:rFonts w:ascii="Noto Naskh Arabic" w:hAnsi="Noto Naskh Arabic" w:eastAsia="Noto Naskh Arabic" w:cs="Noto Naskh Arabic"/>
+      <w:color w:val="000000"/>
+      <w:sz w:val="4"/>
+      <w:szCs w:val="4"/>
+    </w:rPr>
+  </w:style>
+  <w:style w:type="paragraph" w:customStyle="1" w:styleId="ExamSpacerChain">
+    <w:name w:val="ExamSpacerChain"/>
+    <w:basedOn w:val="Normal"/>
+    <w:qFormat/>
+    <w:pPr>
+      <w:keepNext/>
+      <w:bidi/>
+      <w:spacing w:before="0" w:after="0" w:line="40" w:lineRule="exact"/>
+    </w:pPr>
+    <w:rPr>
+      <w:rFonts w:ascii="Noto Naskh Arabic" w:hAnsi="Noto Naskh Arabic" w:eastAsia="Noto Naskh Arabic" w:cs="Noto Naskh Arabic"/>
+      <w:color w:val="000000"/>
+      <w:sz w:val="4"/>
+      <w:szCs w:val="4"/>
+    </w:rPr>
+  </w:style>
+  <w:style w:type="paragraph" w:customStyle="1" w:styleId="ExamSpacerEnd">
+    <w:name w:val="ExamSpacerEnd"/>
+    <w:basedOn w:val="Normal"/>
+    <w:qFormat/>
+    <w:pPr>
+      <w:bidi/>
+      <w:spacing w:before="0" w:after="0" w:line="160" w:lineRule="exact"/>
+    </w:pPr>
+    <w:rPr>
+      <w:rFonts w:ascii="Noto Naskh Arabic" w:hAnsi="Noto Naskh Arabic" w:eastAsia="Noto Naskh Arabic" w:cs="Noto Naskh Arabic"/>
+      <w:color w:val="000000"/>
+      <w:sz w:val="4"/>
+      <w:szCs w:val="4"/>
+    </w:rPr>
+  </w:style>
+  <w:style w:type="paragraph" w:customStyle="1" w:styleId="ExamFooterTail">
+    <w:name w:val="ExamFooterTail"/>
+    <w:basedOn w:val="Normal"/>
+    <w:qFormat/>
+    <w:pPr>
+      <w:bidi/>
+      <w:spacing w:before="0" w:after="0" w:line="20" w:lineRule="exact"/>
+    </w:pPr>
+    <w:rPr>
+      <w:rFonts w:ascii="Noto Naskh Arabic" w:hAnsi="Noto Naskh Arabic" w:eastAsia="Noto Naskh Arabic" w:cs="Noto Naskh Arabic"/>
+      <w:color w:val="000000"/>
+      <w:sz w:val="2"/>
+      <w:szCs w:val="2"/>
+    </w:rPr>
+  </w:style>
+  <w:style w:type="character" w:customStyle="1" w:styleId="ExamBoldChar">
+    <w:name w:val="ExamBoldChar"/>
+    <w:basedOn w:val="DefaultParagraphFont"/>
+    <w:rPr>
+      <w:b/>
+      <w:bCs/>
+    </w:rPr>
+  </w:style>
+  <w:style w:type="character" w:customStyle="1" w:styleId="ExamBubbleChar">
+    <w:name w:val="ExamBubbleChar"/>
+    <w:basedOn w:val="DefaultParagraphFont"/>
+    <w:rPr>
+      <w:rFonts w:ascii="Arial" w:hAnsi="Arial" w:eastAsia="Arial" w:cs="Arial"/>
+      <w:sz w:val="24"/>
+      <w:szCs w:val="24"/>
+    </w:rPr>
+  </w:style>
+  <w:style w:type="character" w:customStyle="1" w:styleId="ExamEndNoteChar">
+    <w:name w:val="ExamEndNoteChar"/>
+    <w:basedOn w:val="DefaultParagraphFont"/>
+    <w:rPr>
+      <w:b w:val="0"/>
+      <w:bCs w:val="0"/>
       <w:color w:val="404040"/>
       <w:sz w:val="20"/>
       <w:szCs w:val="20"/>
     </w:rPr>
   </w:style>
-  <w:style w:type="paragraph" w:customStyle="1" w:styleId="ExamFooter">
-    <w:name w:val="ExamFooter"/>
-    <w:basedOn w:val="Normal"/>
-    <w:qFormat/>
-    <w:pPr>
-      <w:bidi/>
-      <w:spacing w:before="0" w:after="0" w:line="240" w:lineRule="auto"/>
-    </w:pPr>
-    <w:rPr>
-      <w:rFonts w:ascii="Noto Naskh Arabic" w:hAnsi="Noto Naskh Arabic" w:eastAsia="Noto Naskh Arabic" w:cs="Noto Naskh Arabic"/>
-      <w:color w:val="404040"/>
-      <w:sz w:val="18"/>
-      <w:szCs w:val="18"/>
-    </w:rPr>
-  </w:style>
-  <w:style w:type="paragraph" w:customStyle="1" w:styleId="ExamFooterCenter">
-    <w:name w:val="ExamFooterCenter"/>
-    <w:basedOn w:val="Normal"/>
-    <w:qFormat/>
-    <w:pPr>
-      <w:bidi/>
-      <w:spacing w:before="0" w:after="0" w:line="240" w:lineRule="auto"/>
-      <w:jc w:val="center"/>
-    </w:pPr>
-    <w:rPr>
-      <w:rFonts w:ascii="Noto Naskh Arabic" w:hAnsi="Noto Naskh Arabic" w:eastAsia="Noto Naskh Arabic" w:cs="Noto Naskh Arabic"/>
-      <w:color w:val="404040"/>
-      <w:sz w:val="18"/>
-      <w:szCs w:val="18"/>
-    </w:rPr>
-  </w:style>
-  <w:style w:type="paragraph" w:customStyle="1" w:styleId="ExamFooterEnd">
-    <w:name w:val="ExamFooterEnd"/>
-    <w:basedOn w:val="Normal"/>
-    <w:qFormat/>
-    <w:pPr>
-      <w:bidi/>
-      <w:spacing w:before="0" w:after="0" w:line="240" w:lineRule="auto"/>
-      <w:jc w:val="right"/>
-    </w:pPr>
-    <w:rPr>
-      <w:rFonts w:ascii="Noto Naskh Arabic" w:hAnsi="Noto Naskh Arabic" w:eastAsia="Noto Naskh Arabic" w:cs="Noto Naskh Arabic"/>
-      <w:color w:val="404040"/>
-      <w:sz w:val="18"/>
-      <w:szCs w:val="18"/>
-    </w:rPr>
-  </w:style>
-  <w:style w:type="paragraph" w:customStyle="1" w:styleId="ExamSpacer">
-    <w:name w:val="ExamSpacer"/>
-    <w:basedOn w:val="Normal"/>
-    <w:qFormat/>
-    <w:pPr>
-      <w:bidi/>
-      <w:spacing w:before="0" w:after="0" w:line="120" w:lineRule="exact"/>
-    </w:pPr>
-    <w:rPr>
-      <w:rFonts w:ascii="Noto Naskh Arabic" w:hAnsi="Noto Naskh Arabic" w:eastAsia="Noto Naskh Arabic" w:cs="Noto Naskh Arabic"/>
-      <w:color w:val="000000"/>
-      <w:sz w:val="4"/>
-      <w:szCs w:val="4"/>
-    </w:rPr>
-  </w:style>
-  <w:style w:type="paragraph" w:customStyle="1" w:styleId="ExamSpacerChain">
-    <w:name w:val="ExamSpacerChain"/>
-    <w:basedOn w:val="Normal"/>
-    <w:qFormat/>
-    <w:pPr>
-      <w:keepNext/>
-      <w:bidi/>
-      <w:spacing w:before="0" w:after="0" w:line="40" w:lineRule="exact"/>
-    </w:pPr>
-    <w:rPr>
-      <w:rFonts w:ascii="Noto Naskh Arabic" w:hAnsi="Noto Naskh Arabic" w:eastAsia="Noto Naskh Arabic" w:cs="Noto Naskh Arabic"/>
-      <w:color w:val="000000"/>
-      <w:sz w:val="4"/>
-      <w:szCs w:val="4"/>
-    </w:rPr>
-  </w:style>
-  <w:style w:type="paragraph" w:customStyle="1" w:styleId="ExamSpacerEnd">
-    <w:name w:val="ExamSpacerEnd"/>
-    <w:basedOn w:val="Normal"/>
-    <w:qFormat/>
-    <w:pPr>
-      <w:bidi/>
-      <w:spacing w:before="0" w:after="0" w:line="160" w:lineRule="exact"/>
-    </w:pPr>
-    <w:rPr>
-      <w:rFonts w:ascii="Noto Naskh Arabic" w:hAnsi="Noto Naskh Arabic" w:eastAsia="Noto Naskh Arabic" w:cs="Noto Naskh Arabic"/>
-      <w:color w:val="000000"/>
-      <w:sz w:val="4"/>
-      <w:szCs w:val="4"/>
-    </w:rPr>
-  </w:style>
-  <w:style w:type="paragraph" w:customStyle="1" w:styleId="ExamFooterTail">
-    <w:name w:val="ExamFooterTail"/>
-    <w:basedOn w:val="Normal"/>
-    <w:qFormat/>
-    <w:pPr>
-      <w:bidi/>
-      <w:spacing w:before="0" w:after="0" w:line="20" w:lineRule="exact"/>
-    </w:pPr>
-    <w:rPr>
-      <w:rFonts w:ascii="Noto Naskh Arabic" w:hAnsi="Noto Naskh Arabic" w:eastAsia="Noto Naskh Arabic" w:cs="Noto Naskh Arabic"/>
-      <w:color w:val="000000"/>
-      <w:sz w:val="2"/>
-      <w:szCs w:val="2"/>
-    </w:rPr>
-  </w:style>
-  <w:style w:type="character" w:customStyle="1" w:styleId="ExamBoldChar">
-    <w:name w:val="ExamBoldChar"/>
-    <w:basedOn w:val="DefaultParagraphFont"/>
-    <w:rPr>
-      <w:b/>
-      <w:bCs/>
-    </w:rPr>
-  </w:style>
-  <w:style w:type="character" w:customStyle="1" w:styleId="ExamBubbleChar">
-    <w:name w:val="ExamBubbleChar"/>
-    <w:basedOn w:val="DefaultParagraphFont"/>
-    <w:rPr>
-      <w:rFonts w:ascii="Arial" w:hAnsi="Arial" w:eastAsia="Arial" w:cs="Arial"/>
-      <w:sz w:val="24"/>
-      <w:szCs w:val="24"/>
-    </w:rPr>
-  </w:style>
 </w:styles>
 </file>
</xml_diff>